<commit_message>
Publish INT1433 from source 8b4a869
</commit_message>
<xml_diff>
--- a/docs/INT1433_Khung-noi-dung.docx
+++ b/docs/INT1433_Khung-noi-dung.docx
@@ -39,7 +39,15 @@
         <w:pStyle w:val="ListBullet"/>
       </w:pPr>
       <w:r>
-        <w:t>Tên phần là cụm danh từ nêu nội dung; phần áp dụng tổng hợp đặt tên “Bài toán ứng dụng: …”.</w:t>
+        <w:t>Tên phần theo dạng “&lt;chặng&gt;: &lt;chi tiết&gt;” — chặng là nhóm phần trong chương, cũng là cột của slide lộ trình (ví dụ “TCP: kết nối giữa client và server”); phần áp dụng tổng hợp đặt tên “Bài toán ứng dụng: …”.</w:t>
+      </w:r>
+    </w:p>
+    <w:p>
+      <w:pPr>
+        <w:pStyle w:val="ListBullet"/>
+      </w:pPr>
+      <w:r>
+        <w:t>Thời lượng một phần = đọc + khoảng lặng có chủ đích (đọc mã, kết quả chạy, đề câu hỏi); nhắm 7–8′.</w:t>
       </w:r>
     </w:p>
     <w:p>
@@ -683,16 +691,17 @@
         <w:tblLook w:firstColumn="1" w:firstRow="1" w:lastColumn="0" w:lastRow="0" w:noHBand="0" w:noVBand="1" w:val="04A0"/>
       </w:tblPr>
       <w:tblGrid>
-        <w:gridCol w:w="1728"/>
-        <w:gridCol w:w="1728"/>
-        <w:gridCol w:w="1728"/>
-        <w:gridCol w:w="1728"/>
-        <w:gridCol w:w="1728"/>
+        <w:gridCol w:w="1440"/>
+        <w:gridCol w:w="1440"/>
+        <w:gridCol w:w="1440"/>
+        <w:gridCol w:w="1440"/>
+        <w:gridCol w:w="1440"/>
+        <w:gridCol w:w="1440"/>
       </w:tblGrid>
       <w:tr>
         <w:tc>
           <w:tcPr>
-            <w:tcW w:type="dxa" w:w="1728"/>
+            <w:tcW w:type="dxa" w:w="1440"/>
           </w:tcPr>
           <w:p>
             <w:r>
@@ -711,7 +720,7 @@
         </w:tc>
         <w:tc>
           <w:tcPr>
-            <w:tcW w:type="dxa" w:w="1728"/>
+            <w:tcW w:type="dxa" w:w="1440"/>
           </w:tcPr>
           <w:p>
             <w:r>
@@ -730,7 +739,7 @@
         </w:tc>
         <w:tc>
           <w:tcPr>
-            <w:tcW w:type="dxa" w:w="1728"/>
+            <w:tcW w:type="dxa" w:w="1440"/>
           </w:tcPr>
           <w:p>
             <w:r>
@@ -749,7 +758,7 @@
         </w:tc>
         <w:tc>
           <w:tcPr>
-            <w:tcW w:type="dxa" w:w="1728"/>
+            <w:tcW w:type="dxa" w:w="1440"/>
           </w:tcPr>
           <w:p>
             <w:r>
@@ -762,13 +771,32 @@
                 <w:b/>
                 <w:sz w:val="19"/>
               </w:rPr>
+              <w:t>Chặng (số phần)</w:t>
+            </w:r>
+          </w:p>
+        </w:tc>
+        <w:tc>
+          <w:tcPr>
+            <w:tcW w:type="dxa" w:w="1440"/>
+          </w:tcPr>
+          <w:p>
+            <w:r>
+              <w:rPr>
+                <w:sz w:val="19"/>
+              </w:rPr>
+            </w:r>
+            <w:r>
+              <w:rPr>
+                <w:b/>
+                <w:sz w:val="19"/>
+              </w:rPr>
               <w:t>Mạch nội dung</w:t>
             </w:r>
           </w:p>
         </w:tc>
         <w:tc>
           <w:tcPr>
-            <w:tcW w:type="dxa" w:w="1728"/>
+            <w:tcW w:type="dxa" w:w="1440"/>
           </w:tcPr>
           <w:p>
             <w:r>
@@ -789,7 +817,7 @@
       <w:tr>
         <w:tc>
           <w:tcPr>
-            <w:tcW w:type="dxa" w:w="1728"/>
+            <w:tcW w:type="dxa" w:w="1440"/>
           </w:tcPr>
           <w:p>
             <w:r>
@@ -802,7 +830,7 @@
         </w:tc>
         <w:tc>
           <w:tcPr>
-            <w:tcW w:type="dxa" w:w="1728"/>
+            <w:tcW w:type="dxa" w:w="1440"/>
           </w:tcPr>
           <w:p>
             <w:r>
@@ -815,7 +843,7 @@
         </w:tc>
         <w:tc>
           <w:tcPr>
-            <w:tcW w:type="dxa" w:w="1728"/>
+            <w:tcW w:type="dxa" w:w="1440"/>
           </w:tcPr>
           <w:p>
             <w:r>
@@ -828,7 +856,20 @@
         </w:tc>
         <w:tc>
           <w:tcPr>
-            <w:tcW w:type="dxa" w:w="1728"/>
+            <w:tcW w:type="dxa" w:w="1440"/>
+          </w:tcPr>
+          <w:p>
+            <w:r>
+              <w:rPr>
+                <w:sz w:val="19"/>
+              </w:rPr>
+              <w:t>Định danh (1) → Giao vận (1) → Stream (3) → Bài toán ứng dụng (1)</w:t>
+            </w:r>
+          </w:p>
+        </w:tc>
+        <w:tc>
+          <w:tcPr>
+            <w:tcW w:type="dxa" w:w="1440"/>
           </w:tcPr>
           <w:p>
             <w:r>
@@ -841,7 +882,7 @@
         </w:tc>
         <w:tc>
           <w:tcPr>
-            <w:tcW w:type="dxa" w:w="1728"/>
+            <w:tcW w:type="dxa" w:w="1440"/>
           </w:tcPr>
           <w:p>
             <w:r>
@@ -856,7 +897,7 @@
       <w:tr>
         <w:tc>
           <w:tcPr>
-            <w:tcW w:type="dxa" w:w="1728"/>
+            <w:tcW w:type="dxa" w:w="1440"/>
           </w:tcPr>
           <w:p>
             <w:r>
@@ -869,7 +910,7 @@
         </w:tc>
         <w:tc>
           <w:tcPr>
-            <w:tcW w:type="dxa" w:w="1728"/>
+            <w:tcW w:type="dxa" w:w="1440"/>
           </w:tcPr>
           <w:p>
             <w:r>
@@ -882,7 +923,7 @@
         </w:tc>
         <w:tc>
           <w:tcPr>
-            <w:tcW w:type="dxa" w:w="1728"/>
+            <w:tcW w:type="dxa" w:w="1440"/>
           </w:tcPr>
           <w:p>
             <w:r>
@@ -895,7 +936,20 @@
         </w:tc>
         <w:tc>
           <w:tcPr>
-            <w:tcW w:type="dxa" w:w="1728"/>
+            <w:tcW w:type="dxa" w:w="1440"/>
+          </w:tcPr>
+          <w:p>
+            <w:r>
+              <w:rPr>
+                <w:sz w:val="19"/>
+              </w:rPr>
+              <w:t>TCP (3) → Đa luồng (4)</w:t>
+            </w:r>
+          </w:p>
+        </w:tc>
+        <w:tc>
+          <w:tcPr>
+            <w:tcW w:type="dxa" w:w="1440"/>
           </w:tcPr>
           <w:p>
             <w:r>
@@ -908,7 +962,7 @@
         </w:tc>
         <w:tc>
           <w:tcPr>
-            <w:tcW w:type="dxa" w:w="1728"/>
+            <w:tcW w:type="dxa" w:w="1440"/>
           </w:tcPr>
           <w:p>
             <w:r>
@@ -923,7 +977,7 @@
       <w:tr>
         <w:tc>
           <w:tcPr>
-            <w:tcW w:type="dxa" w:w="1728"/>
+            <w:tcW w:type="dxa" w:w="1440"/>
           </w:tcPr>
           <w:p>
             <w:r>
@@ -936,7 +990,7 @@
         </w:tc>
         <w:tc>
           <w:tcPr>
-            <w:tcW w:type="dxa" w:w="1728"/>
+            <w:tcW w:type="dxa" w:w="1440"/>
           </w:tcPr>
           <w:p>
             <w:r>
@@ -949,7 +1003,7 @@
         </w:tc>
         <w:tc>
           <w:tcPr>
-            <w:tcW w:type="dxa" w:w="1728"/>
+            <w:tcW w:type="dxa" w:w="1440"/>
           </w:tcPr>
           <w:p>
             <w:r>
@@ -962,7 +1016,20 @@
         </w:tc>
         <w:tc>
           <w:tcPr>
-            <w:tcW w:type="dxa" w:w="1728"/>
+            <w:tcW w:type="dxa" w:w="1440"/>
+          </w:tcPr>
+          <w:p>
+            <w:r>
+              <w:rPr>
+                <w:sz w:val="19"/>
+              </w:rPr>
+              <w:t>UDP (1) → Multicast (2) → WebSocket (2) → HTTP/2 (1) → HTTP/3 (1)</w:t>
+            </w:r>
+          </w:p>
+        </w:tc>
+        <w:tc>
+          <w:tcPr>
+            <w:tcW w:type="dxa" w:w="1440"/>
           </w:tcPr>
           <w:p>
             <w:r>
@@ -975,7 +1042,7 @@
         </w:tc>
         <w:tc>
           <w:tcPr>
-            <w:tcW w:type="dxa" w:w="1728"/>
+            <w:tcW w:type="dxa" w:w="1440"/>
           </w:tcPr>
           <w:p>
             <w:r>
@@ -990,7 +1057,7 @@
       <w:tr>
         <w:tc>
           <w:tcPr>
-            <w:tcW w:type="dxa" w:w="1728"/>
+            <w:tcW w:type="dxa" w:w="1440"/>
           </w:tcPr>
           <w:p>
             <w:r>
@@ -1003,7 +1070,7 @@
         </w:tc>
         <w:tc>
           <w:tcPr>
-            <w:tcW w:type="dxa" w:w="1728"/>
+            <w:tcW w:type="dxa" w:w="1440"/>
           </w:tcPr>
           <w:p>
             <w:r>
@@ -1016,7 +1083,7 @@
         </w:tc>
         <w:tc>
           <w:tcPr>
-            <w:tcW w:type="dxa" w:w="1728"/>
+            <w:tcW w:type="dxa" w:w="1440"/>
           </w:tcPr>
           <w:p>
             <w:r>
@@ -1029,7 +1096,20 @@
         </w:tc>
         <w:tc>
           <w:tcPr>
-            <w:tcW w:type="dxa" w:w="1728"/>
+            <w:tcW w:type="dxa" w:w="1440"/>
+          </w:tcPr>
+          <w:p>
+            <w:r>
+              <w:rPr>
+                <w:sz w:val="19"/>
+              </w:rPr>
+              <w:t>RPC (2) → Web service (2) → gRPC (2) → Message broker (2)</w:t>
+            </w:r>
+          </w:p>
+        </w:tc>
+        <w:tc>
+          <w:tcPr>
+            <w:tcW w:type="dxa" w:w="1440"/>
           </w:tcPr>
           <w:p>
             <w:r>
@@ -1042,7 +1122,7 @@
         </w:tc>
         <w:tc>
           <w:tcPr>
-            <w:tcW w:type="dxa" w:w="1728"/>
+            <w:tcW w:type="dxa" w:w="1440"/>
           </w:tcPr>
           <w:p>
             <w:r>
@@ -1057,7 +1137,7 @@
       <w:tr>
         <w:tc>
           <w:tcPr>
-            <w:tcW w:type="dxa" w:w="1728"/>
+            <w:tcW w:type="dxa" w:w="1440"/>
           </w:tcPr>
           <w:p>
             <w:r>
@@ -1070,7 +1150,7 @@
         </w:tc>
         <w:tc>
           <w:tcPr>
-            <w:tcW w:type="dxa" w:w="1728"/>
+            <w:tcW w:type="dxa" w:w="1440"/>
           </w:tcPr>
           <w:p>
             <w:r>
@@ -1083,7 +1163,7 @@
         </w:tc>
         <w:tc>
           <w:tcPr>
-            <w:tcW w:type="dxa" w:w="1728"/>
+            <w:tcW w:type="dxa" w:w="1440"/>
           </w:tcPr>
           <w:p>
             <w:r>
@@ -1096,7 +1176,20 @@
         </w:tc>
         <w:tc>
           <w:tcPr>
-            <w:tcW w:type="dxa" w:w="1728"/>
+            <w:tcW w:type="dxa" w:w="1440"/>
+          </w:tcPr>
+          <w:p>
+            <w:r>
+              <w:rPr>
+                <w:sz w:val="19"/>
+              </w:rPr>
+              <w:t>Bảo mật (2) → Hiệu năng (2) → Độ tin cậy (2) → IoT (1)</w:t>
+            </w:r>
+          </w:p>
+        </w:tc>
+        <w:tc>
+          <w:tcPr>
+            <w:tcW w:type="dxa" w:w="1440"/>
           </w:tcPr>
           <w:p>
             <w:r>
@@ -1109,7 +1202,7 @@
         </w:tc>
         <w:tc>
           <w:tcPr>
-            <w:tcW w:type="dxa" w:w="1728"/>
+            <w:tcW w:type="dxa" w:w="1440"/>
           </w:tcPr>
           <w:p>
             <w:r>

</xml_diff>

<commit_message>
Publish INT1433 from source 2a3f713
</commit_message>
<xml_diff>
--- a/docs/INT1433_Khung-noi-dung.docx
+++ b/docs/INT1433_Khung-noi-dung.docx
@@ -6008,7 +6008,7 @@
         <w:t xml:space="preserve">Vấn đề: </w:t>
       </w:r>
       <w:r>
-        <w:t>Ở phần công cụ, NetCat thực hiện việc thiết lập kết nối thay cho chương trình. Server Java phải tự mở port và chờ kết nối; client Java phải tự kết nối tới endpoint của server.</w:t>
+        <w:t>Ở bài toán ứng dụng cuối Chương 1, giao thức tra cứu được thử bằng NetCat: công cụ tự mở port, chờ và thiết lập kết nối. Server Java phải tự mở port và chờ kết nối; client Java phải tự kết nối tới endpoint của server.</w:t>
       </w:r>
     </w:p>
     <w:p>
@@ -6092,7 +6092,7 @@
         <w:t xml:space="preserve">Cơ chế: </w:t>
       </w:r>
       <w:r>
-        <w:t>Hình hai vai trò: server mở listening socket ở port 9199 (passive open), client kết nối tới (active open), accept() trả về connected socket. Hình bắt tay ba bước (7 bước), hai phía tách riêng: client gọi connect() → gửi SYN → server trả SYN+ACK → client gửi ACK, connect() trả về → phía server nhận ACK, kết nối vào backlog → accept() lấy kết nối ra → connected socket.</w:t>
+        <w:t>Hình hai vai trò: server mở listening socket ở port 9199 (passive open), client kết nối tới (active open), accept() trả về connected socket. Hình bắt tay ba bước (7 bước đánh số, ô backlog hiện riêng), hai phía tách riêng: client gọi connect() → gửi SYN → server trả SYN+ACK → client gửi ACK, connect() trả về → phía server nhận ACK, kết nối vào backlog → accept() lấy kết nối ra → connected socket.</w:t>
       </w:r>
     </w:p>
     <w:p>

</xml_diff>

<commit_message>
Publish INT1433 from source 2a3f713-dirty
</commit_message>
<xml_diff>
--- a/docs/INT1433_Khung-noi-dung.docx
+++ b/docs/INT1433_Khung-noi-dung.docx
@@ -28738,7 +28738,7 @@
               <w:rPr>
                 <w:sz w:val="19"/>
               </w:rPr>
-              <w:t>case study</w:t>
+              <w:t>case study, chặng</w:t>
             </w:r>
           </w:p>
         </w:tc>
@@ -28751,7 +28751,7 @@
               <w:rPr>
                 <w:sz w:val="19"/>
               </w:rPr>
-              <w:t>Dùng tên chuẩn trong glossary.</w:t>
+              <w:t>Dùng tên chuẩn trong glossary; dùng 'nhóm' thay cho 'chặng'.</w:t>
             </w:r>
           </w:p>
         </w:tc>

</xml_diff>